<commit_message>
paper: stages 2 and 3 are released, so the preprint no longer says training code is withheld
Rebuilt both PDFs (still 6 pages) and the DOCX. Zenodo record 23643146 was
updated in place with the same DOI: author corrected to Li, Chenhe and all
three files replaced.
</commit_message>
<xml_diff>
--- a/paper/IntraSpanNet-zh.docx
+++ b/paper/IntraSpanNet-zh.docx
@@ -5444,7 +5444,55 @@
         <w:rPr>
           <w:rFonts w:hint="eastAsia"/>
         </w:rPr>
-        <w:t xml:space="preserve">训练代码不在发布包内，因为它依赖实验数据的目录结构，换一个团队使用前需要清理；而发布的检查点、54</w:t>
+        <w:t xml:space="preserve">第二、第三阶段的训练代码以文档化的接口发布：</w:t>
+      </w:r>
+      <w:r>
+        <w:rPr>
+          <w:rStyle w:val="VerbatimChar"/>
+        </w:rPr>
+        <w:t xml:space="preserve">SFTConfig</w:t>
+      </w:r>
+      <w:r>
+        <w:t xml:space="preserve">、</w:t>
+      </w:r>
+      <w:r>
+        <w:rPr>
+          <w:rStyle w:val="VerbatimChar"/>
+        </w:rPr>
+        <w:t xml:space="preserve">compute_sft_loss</w:t>
+      </w:r>
+      <w:r>
+        <w:t xml:space="preserve">、</w:t>
+      </w:r>
+      <w:r>
+        <w:rPr>
+          <w:rStyle w:val="VerbatimChar"/>
+        </w:rPr>
+        <w:t xml:space="preserve">RLConfig</w:t>
+      </w:r>
+      <w:r>
+        <w:t xml:space="preserve">、</w:t>
+      </w:r>
+      <w:r>
+        <w:rPr>
+          <w:rStyle w:val="VerbatimChar"/>
+        </w:rPr>
+        <w:t xml:space="preserve">compute_rl_loss</w:t>
+      </w:r>
+      <w:r>
+        <w:rPr>
+          <w:rFonts w:hint="eastAsia"/>
+        </w:rPr>
+        <w:t xml:space="preserve">、步进驱动，以及一个能适配改过标签集的热启动函数，另附两个可直接运行的示例和一份使用说明，其他团队可以在自己的抓包上继续训练。第一阶段不发布，因为它依赖</w:t>
+      </w:r>
+      <w:r>
+        <w:t xml:space="preserve"> 40,283 </w:t>
+      </w:r>
+      <w:r>
+        <w:rPr>
+          <w:rFonts w:hint="eastAsia"/>
+        </w:rPr>
+        <w:t xml:space="preserve">条实验流量的目录结构。发布的检查点、54</w:t>
       </w:r>
       <w:r>
         <w:t xml:space="preserve"> </w:t>

</xml_diff>